<commit_message>
Apply copy edits from the review pass
Three changes from Khushi's pass over COPY.docx:

- home.intro: active voice for the three achievements (recovered,
  cut, co-filed) instead of the passive list.
- about.stillBuilding: reframed around scaling the ownership she has
  rather than the team experience she lacks.
- resume.summary: opens as "Technical product manager" rather than
  "Engineer moving into product management", and tightens the rest.

The kill-line bullet she flagged was checked and needed no change.

Co-Authored-By: Claude Opus 5 <noreply@anthropic.com>
</commit_message>
<xml_diff>
--- a/COPY.docx
+++ b/COPY.docx
@@ -284,7 +284,7 @@
     </w:p>
     <w:p>
       <w:r>
-        <w:t>Four years of end-to-end product ownership at Ola Electric, shipping battery-management features to millions of EVs. ₹3 Cr of hardware recovered, false alerts cut 80%, one patent co-filed. Top Fellow at Next Leap, and now I build AI products solo, start to finish.</w:t>
+        <w:t>Four years of end-to-end product ownership at Ola Electric, shipping battery management features to millions of EVs. Recovered ₹3 Cr of hardware, cut false alerts by 80%, and co-filed a patent. Top Fellow at Next Leap, and now I build AI products solo, start to finish.</w:t>
       </w:r>
     </w:p>
     <w:p>
@@ -991,7 +991,7 @@
     </w:p>
     <w:p>
       <w:r>
-        <w:t>So far I've mostly shipped alone, or as the one person holding both the spec and the code. That taught me ownership, but not yet what it's like to drive a roadmap through a team where I'm not also the one building it. That's the gap I want the next role to close.</w:t>
+        <w:t>So far I've mostly shipped alone, holding both the spec and the code. That built deep technical ownership, and now I am ready to scale that rigor across a cross-functional product team where I drive the roadmap directly.</w:t>
       </w:r>
     </w:p>
     <w:p>
@@ -1646,7 +1646,7 @@
     </w:p>
     <w:p>
       <w:r>
-        <w:t>Engineer moving into product management. 3.9 years at Ola Electric owning battery-management features end to end across millions of EVs: ₹3 Cr of scrapped hardware recovered, false failure alerts cut 80%, one patent co-filed. Top Fellow at Next Leap. I scope ambiguous problems into specs, mine fleet telemetry to decide what to build, and drive delivery across teams to launch. Now building AI products solo, from problem definition through to a shipped app.</w:t>
+        <w:t>Technical product manager with 3.9 years of end-to-end ownership at Ola Electric across millions of EVs: recovered ₹3 Cr of hardware, cut false failure alerts by 80%, and co-filed a patent. Top Fellow at Next Leap. I scope ambiguous problems into specs, mine telemetry to decide what to build, and drive cross-functional delivery to launch. Now building AI products solo, from problem definition through to a shipped app.</w:t>
       </w:r>
     </w:p>
     <w:p>

</xml_diff>

<commit_message>
Add the smallcase product teardown
Second entry under Product teardowns. 21-slide deck hosted, four slides
rendered inline: the thesis, the critical finding, the defect log and
the recommendations.

The entry leads with what the session did not cover, so the teardown
cannot be read as claiming more evidence than it has, and the
recommendation section carries the measure for each action.

Co-Authored-By: Claude Opus 5 <noreply@anthropic.com>
</commit_message>
<xml_diff>
--- a/COPY.docx
+++ b/COPY.docx
@@ -5220,6 +5220,205 @@
     <w:p>
       <w:r>
         <w:t>Building the refusal behavior took longer than building the retrieval. Testing and tuning when the assistant should say "I can't answer that" is a much less well-trodden problem than testing when it should answer correctly. I'd budget for that asymmetry earlier next time rather than treating refusal as a small add-on at the end.</w:t>
+      </w:r>
+    </w:p>
+    <w:p>
+      <w:pPr>
+        <w:pStyle w:val="Heading2"/>
+      </w:pPr>
+      <w:r>
+        <w:t>smallcase Product Teardown</w:t>
+      </w:r>
+    </w:p>
+    <w:p>
+      <w:pPr>
+        <w:spacing w:after="80"/>
+      </w:pPr>
+      <w:r>
+        <w:rPr>
+          <w:rFonts w:ascii="Consolas" w:hAnsi="Consolas"/>
+          <w:color w:val="9A3D1F"/>
+          <w:sz w:val="16"/>
+        </w:rPr>
+        <w:t xml:space="preserve">[project.smallcase-teardown.title]  </w:t>
+      </w:r>
+      <w:r>
+        <w:t>smallcase Product Teardown</w:t>
+      </w:r>
+    </w:p>
+    <w:p>
+      <w:pPr>
+        <w:spacing w:after="80"/>
+      </w:pPr>
+      <w:r>
+        <w:rPr>
+          <w:rFonts w:ascii="Consolas" w:hAnsi="Consolas"/>
+          <w:color w:val="9A3D1F"/>
+          <w:sz w:val="16"/>
+        </w:rPr>
+        <w:t xml:space="preserve">[project.smallcase-teardown.meta]  </w:t>
+      </w:r>
+      <w:r>
+        <w:t>teardown · Experiment · July 2026</w:t>
+      </w:r>
+    </w:p>
+    <w:p>
+      <w:pPr>
+        <w:spacing w:after="80"/>
+      </w:pPr>
+      <w:r>
+        <w:rPr>
+          <w:rFonts w:ascii="Consolas" w:hAnsi="Consolas"/>
+          <w:color w:val="9A3D1F"/>
+          <w:sz w:val="16"/>
+        </w:rPr>
+        <w:t xml:space="preserve">[project.smallcase-teardown.tags]  </w:t>
+      </w:r>
+      <w:r>
+        <w:t>Retention analysis, Trust &amp; data integrity, Competitive read</w:t>
+      </w:r>
+    </w:p>
+    <w:p>
+      <w:pPr>
+        <w:spacing w:after="0" w:before="200"/>
+      </w:pPr>
+      <w:r>
+        <w:rPr>
+          <w:b/>
+        </w:rPr>
+        <w:t>Summary, shown on the tile</w:t>
+      </w:r>
+    </w:p>
+    <w:p>
+      <w:pPr>
+        <w:spacing w:after="40" w:before="120"/>
+      </w:pPr>
+      <w:r>
+        <w:rPr>
+          <w:rFonts w:ascii="Consolas" w:hAnsi="Consolas"/>
+          <w:color w:val="9A3D1F"/>
+          <w:sz w:val="16"/>
+        </w:rPr>
+        <w:t>[project.smallcase-teardown.summary]</w:t>
+      </w:r>
+    </w:p>
+    <w:p>
+      <w:r>
+        <w:t>smallcase is building a trust product on top of a transaction product's instincts. A 21-slide teardown from one six-minute session: the net-worth ledger shipped a confident headline number on holdings 16 months stale, the marketplace ranks its own in-house baskets on a leaderboard it computes itself, and 12 defects surfaced in the time it took to scroll the app.</w:t>
+      </w:r>
+    </w:p>
+    <w:p>
+      <w:pPr>
+        <w:spacing w:after="0" w:before="200"/>
+      </w:pPr>
+      <w:r>
+        <w:rPr>
+          <w:b/>
+        </w:rPr>
+        <w:t>First section, heading "Scope &amp; lens"</w:t>
+      </w:r>
+    </w:p>
+    <w:p>
+      <w:pPr>
+        <w:spacing w:after="40" w:before="120"/>
+      </w:pPr>
+      <w:r>
+        <w:rPr>
+          <w:rFonts w:ascii="Consolas" w:hAnsi="Consolas"/>
+          <w:color w:val="9A3D1F"/>
+          <w:sz w:val="16"/>
+        </w:rPr>
+        <w:t>[project.smallcase-teardown.whyBuilt]</w:t>
+      </w:r>
+    </w:p>
+    <w:p>
+      <w:r>
+        <w:t>Evidence base: one uninterrupted Android session, 21:14 to 21:20 on a single July 2026 evening, 20 screens reviewed. The teardown states up front what it did not see, so it cannot be read as claiming more than it has: no order placement or broker execution, no Investments tab, no Credit tab, no search, no paywall or real pricing, no first-run onboarding, and no view of what the returns figures look like unlocked. Capture order is not a user journey, so no intent is inferred from the sequence, with one exception: the Weekly Wrap is an authored linear story whose own progress indicator fixes card position 1 to 8, so claims about that ordering hold where claims about ordering elsewhere do not. Lens: smallcase sells curated baskets executed through your existing broker, which is a transaction business with weak switching costs. But the screens with the most investment behind them (Wealth Office, Ask AI, Forecast 2029, Credit, US equities) are aimed at a different job: own the household ledger. A basket is a purchase, a net worth is a relationship, and the teardown reads every finding against the gap between those two.</w:t>
+      </w:r>
+    </w:p>
+    <w:p>
+      <w:pPr>
+        <w:spacing w:after="0" w:before="200"/>
+      </w:pPr>
+      <w:r>
+        <w:rPr>
+          <w:b/>
+        </w:rPr>
+        <w:t>Second section, heading "The critical finding, and what I would do"</w:t>
+      </w:r>
+    </w:p>
+    <w:p>
+      <w:pPr>
+        <w:spacing w:after="40" w:before="120"/>
+      </w:pPr>
+      <w:r>
+        <w:rPr>
+          <w:rFonts w:ascii="Consolas" w:hAnsi="Consolas"/>
+          <w:color w:val="9A3D1F"/>
+          <w:sz w:val="16"/>
+        </w:rPr>
+        <w:t>[project.smallcase-teardown.lesson]</w:t>
+      </w:r>
+    </w:p>
+    <w:p>
+      <w:r>
+        <w:t>The Wealth Office displays a net worth of ₹4.23L with a ▲₹2.34K monthly delta and a dashed three-year forecast cone out to 2029, on holdings last synced in March 2025. Sixteen months stale, rendered as current, with a dismissible toast as the only tell. The defect is not the stale data, it is the confidence rendered on top of it, and Ask AI reads the same inputs. A net-worth product's entire value is that the number is true, so this is the worst possible bug in the worst possible place. Two other trust cracks sit beside it: 3 of the 5 top stock baskets by inflow are Windmill Capital, smallcase's own in-house research arm, ranked on a leaderboard the platform computes itself with no disclosure of the relationship, which is the Amazon Basics problem. And the card whose only job is ranking prints its ranks as 1, 2, 3, 2, 5. My P0 is trust integrity: never render a net worth, delta or forecast from inputs past a staleness threshold, make re-auth the primary action rather than a dismissible banner, and put a QA gate on the Weekly Wrap pipeline before publish, measured by the share of views served a stale-flagged number and resync completion within 7 days. P1 is conversion honesty: show something on returns before the unlock so users stop ranking baskets by minimum ticket size, label first-party baskets before someone else does it for you, and break the sequence that ends a fear-framed story on a buy-adjacent CTA. P2 is structural: promote Wealth Office into primary nav, move the activation checklist above three screens of merchandising, give Create a fork-an-existing-basket first step, and attack the 72× cliff between a ₹300 beginner basket and a ₹21,701 themed one that sit in the same browsing surface.</w:t>
+      </w:r>
+    </w:p>
+    <w:p>
+      <w:pPr>
+        <w:spacing w:after="0" w:before="200"/>
+      </w:pPr>
+      <w:r>
+        <w:rPr>
+          <w:b/>
+        </w:rPr>
+        <w:t>Image alt text</w:t>
+      </w:r>
+    </w:p>
+    <w:p>
+      <w:pPr>
+        <w:spacing w:after="40" w:before="120"/>
+      </w:pPr>
+      <w:r>
+        <w:rPr>
+          <w:rFonts w:ascii="Consolas" w:hAnsi="Consolas"/>
+          <w:color w:val="9A3D1F"/>
+          <w:sz w:val="16"/>
+        </w:rPr>
+        <w:t>[project.smallcase-teardown.screens]</w:t>
+      </w:r>
+    </w:p>
+    <w:p>
+      <w:pPr>
+        <w:pStyle w:val="ListBullet"/>
+      </w:pPr>
+      <w:r>
+        <w:t>/projects/smallcase-thesis.webp: Thesis slide: two products and two instincts, contrasting the polished transaction layer against the trust layer shipping a headline net worth built on sixteen-month-old data</w:t>
+      </w:r>
+    </w:p>
+    <w:p>
+      <w:pPr>
+        <w:pStyle w:val="ListBullet"/>
+      </w:pPr>
+      <w:r>
+        <w:t>/projects/smallcase-stale-data.webp: Critical finding slide: a timeline from holdings last synced in March 2025, to a net worth displayed as current in July 2026, to a three-year forecast cone rendered out to 2029</w:t>
+      </w:r>
+    </w:p>
+    <w:p>
+      <w:pPr>
+        <w:pStyle w:val="ListBullet"/>
+      </w:pPr>
+      <w:r>
+        <w:t>/projects/smallcase-defect-log.webp: Defect log slide listing twelve issues found in six minutes, graded from critical to low, with screen and severity for each</w:t>
+      </w:r>
+    </w:p>
+    <w:p>
+      <w:pPr>
+        <w:pStyle w:val="ListBullet"/>
+      </w:pPr>
+      <w:r>
+        <w:t>/projects/smallcase-recommendations.webp: Recommendations slide with P0 trust integrity and P1 conversion honesty, each action paired with the metric that would show whether it worked</w:t>
       </w:r>
     </w:p>
     <w:p>

</xml_diff>